<commit_message>
bz ui somewhat done
</commit_message>
<xml_diff>
--- a/41BZ Bezpeka ta zahyst program/1/KNT-122_Onyshchenko_Variant-19_PR1.docx
+++ b/41BZ Bezpeka ta zahyst program/1/KNT-122_Onyshchenko_Variant-19_PR1.docx
@@ -1783,7 +1783,7 @@
   </w:style>
   <w:style w:type="paragraph" w:styleId="IndexHeading">
     <w:name w:val="index heading"/>
-    <w:basedOn w:val="Style12"/>
+    <w:basedOn w:val="user"/>
     <w:pPr/>
     <w:rPr/>
   </w:style>
@@ -2047,8 +2047,8 @@
       <w:lang w:val="en-US"/>
     </w:rPr>
   </w:style>
-  <w:style w:type="numbering" w:styleId="Style14" w:default="1">
-    <w:name w:val="Без маркерів"/>
+  <w:style w:type="numbering" w:styleId="user2" w:default="1">
+    <w:name w:val="Без маркерів (user)"/>
     <w:uiPriority w:val="99"/>
     <w:semiHidden/>
     <w:unhideWhenUsed/>

</xml_diff>